<commit_message>
Technical Track: custom-only identification is the best practice
W05 stays a platform demo (built-ins shown as what PDC offers), but the
Technical Track now states the production stance: governed programs run
identification on custom dictionaries and patterns ONLY - built-ins are
opaque, unversioned and release-dependent, so tags they stamp cannot be
audited or diffed. Callouts added to Module 02 (methods taxonomy),
Module 03 (lab intro - this library IS the production policy) and the
Policy Generator workshop (Select Methods: custom set only). Docx
regenerated for all three.

Co-Authored-By: Claude Fable 5 <noreply@anthropic.com>
</commit_message>
<xml_diff>
--- a/courseware/CSCU/Platform/Technical-Track/02-Data-Identification/Data-Identification-Guide.docx
+++ b/courseware/CSCU/Platform/Technical-Track/02-Data-Identification/Data-Identification-Guide.docx
@@ -578,6 +578,46 @@
       </w:r>
       <w:r>
         <w:t xml:space="preserve"> Built for your business context. Authoring these — for CSCU's account types, transaction codes, risk ratings and NACHA return codes — is the work of Module 03, and 18 ready-made CSCU dictionaries ship with it.</w:t>
+      </w:r>
+    </w:p>
+    <w:p>
+      <w:pPr>
+        <w:pBdr>
+          <w:left w:val="single" w:sz="12" w:space="8" w:color="065A82"/>
+        </w:pBdr>
+        <w:shd w:val="clear" w:color="auto" w:fill="EEF6FA"/>
+        <w:ind w:left="240" w:right="240"/>
+        <w:spacing w:before="120" w:after="160"/>
+      </w:pPr>
+      <w:r>
+        <w:rPr>
+          <w:b/>
+          <w:bCs/>
+        </w:rPr>
+        <w:t xml:space="preserve">Best practice — custom methods only in production.</w:t>
+      </w:r>
+      <w:r>
+        <w:t xml:space="preserve"> The built-ins are useful for a first exploration (and the platform workshops demo them), but a governed identification program runs on </w:t>
+      </w:r>
+      <w:r>
+        <w:rPr>
+          <w:b/>
+          <w:bCs/>
+        </w:rPr>
+        <w:t xml:space="preserve">custom dictionaries and patterns only</w:t>
+      </w:r>
+      <w:r>
+        <w:t xml:space="preserve">: built-ins are opaque, unversioned, and change between PDC releases, so a tag stamped by one cannot be audited or diffed. A custom method is a reviewable artifact — its regex or value list came from profiled evidence, it lives in version control, and every change is tracked. At </w:t>
+      </w:r>
+      <w:r>
+        <w:rPr>
+          <w:b/>
+          <w:bCs/>
+        </w:rPr>
+        <w:t xml:space="preserve">Select Methods</w:t>
+      </w:r>
+      <w:r>
+        <w:t xml:space="preserve">, the production policy is simply: select only your own prefixed method set. Anything a built-in would have covered (SSNs, emails, phones, states) is authored as a custom method from a vetted canonical shape or curated list instead.</w:t>
       </w:r>
     </w:p>
     <w:p>

</xml_diff>